<commit_message>
Index: put a dated authority banner over the status table
The cost band moved three times today -- $13M-$182M, then $26M-$182M, then
$28M-$166M once the red team S-3 pool-pairing fix landed -- and the status
table still carries the first two in rows that belong to the drafting and
fiscal passes now rewriting them. Rather than re-pin a number in each row and
collide with those passes, the Status section now opens with a dated banner
that names the current authority (00 v1.3's own banner), lists all four
retracted figures together, and says plainly that the table below loses where
the two disagree.

Four retracted figures is the thing a reader needs on arrival, and until now
they had to reconstruct it from three documents.

Co-Authored-By: Claude Opus 5 <noreply@anthropic.com>
</commit_message>
<xml_diff>
--- a/briefs/2027-military-service-credit-cost-window/README.docx
+++ b/briefs/2027-military-service-credit-cost-window/README.docx
@@ -900,6 +900,306 @@
       </w:pPr>
       <w:r>
         <w:t>Status</w:t>
+      </w:r>
+    </w:p>
+    <w:p>
+      <w:pPr>
+        <w:spacing w:before="120" w:after="120"/>
+        <w:ind w:left="480"/>
+      </w:pPr>
+      <w:r>
+        <w:rPr>
+          <w:b/>
+          <w:i/>
+          <w:color w:val="444444"/>
+          <w:sz w:val="20"/>
+        </w:rPr>
+        <w:t>Read this before quoting any figure out of the table below. Lead attorney, October 25, 2026, 12:40.</w:t>
+      </w:r>
+    </w:p>
+    <w:p>
+      <w:pPr>
+        <w:spacing w:before="120" w:after="120"/>
+        <w:ind w:left="480"/>
+      </w:pPr>
+      <w:r>
+        <w:rPr>
+          <w:i/>
+          <w:color w:val="444444"/>
+          <w:sz w:val="20"/>
+        </w:rPr>
+        <w:t xml:space="preserve">The package is mid-reconciliation after the red team verdict, and the cost band has moved three times in one day. </w:t>
+      </w:r>
+      <w:r>
+        <w:rPr>
+          <w:b/>
+          <w:i/>
+          <w:color w:val="444444"/>
+          <w:sz w:val="20"/>
+        </w:rPr>
+        <w:t xml:space="preserve">The current authority is the banner at the top of </w:t>
+      </w:r>
+      <w:hyperlink r:id="rId11">
+        <w:r>
+          <w:rPr>
+            <w:rFonts w:ascii="Calibri" w:hAnsi="Calibri"/>
+            <w:color w:val="1A4F8A"/>
+            <w:u w:val="single"/>
+            <w:sz w:val="20"/>
+            <w:b/>
+          </w:rPr>
+          <w:t xml:space="preserve">00-ONE-PAGE-BRIEF.md</w:t>
+        </w:r>
+      </w:hyperlink>
+      <w:r>
+        <w:rPr>
+          <w:b/>
+          <w:i/>
+          <w:color w:val="444444"/>
+          <w:sz w:val="20"/>
+        </w:rPr>
+        <w:t>, v1.3</w:t>
+      </w:r>
+      <w:r>
+        <w:rPr>
+          <w:i/>
+          <w:color w:val="444444"/>
+          <w:sz w:val="20"/>
+        </w:rPr>
+        <w:t xml:space="preserve">, which states the corrected model run: </w:t>
+      </w:r>
+      <w:r>
+        <w:rPr>
+          <w:b/>
+          <w:i/>
+          <w:color w:val="444444"/>
+          <w:sz w:val="20"/>
+        </w:rPr>
+        <w:t>$28M–$166M</w:t>
+      </w:r>
+      <w:r>
+        <w:rPr>
+          <w:i/>
+          <w:color w:val="444444"/>
+          <w:sz w:val="20"/>
+        </w:rPr>
+        <w:t xml:space="preserve"> one-time present value, after the red team S-3 pool-pairing fix and with the floor taken from the current 10%–30% scenario set. That band </w:t>
+      </w:r>
+      <w:r>
+        <w:rPr>
+          <w:b/>
+          <w:i/>
+          <w:color w:val="444444"/>
+          <w:sz w:val="20"/>
+        </w:rPr>
+        <w:t xml:space="preserve">supersedes both </w:t>
+      </w:r>
+      <w:r>
+        <w:rPr>
+          <w:rFonts w:ascii="Consolas" w:hAnsi="Consolas"/>
+          <w:b/>
+          <w:i/>
+          <w:color w:val="303030"/>
+          <w:sz w:val="18"/>
+        </w:rPr>
+        <w:t>$13M–$182M</w:t>
+      </w:r>
+      <w:r>
+        <w:rPr>
+          <w:b/>
+          <w:i/>
+          <w:color w:val="444444"/>
+          <w:sz w:val="20"/>
+        </w:rPr>
+        <w:t xml:space="preserve"> and the </w:t>
+      </w:r>
+      <w:r>
+        <w:rPr>
+          <w:rFonts w:ascii="Consolas" w:hAnsi="Consolas"/>
+          <w:b/>
+          <w:i/>
+          <w:color w:val="303030"/>
+          <w:sz w:val="18"/>
+        </w:rPr>
+        <w:t>$26M–$182M</w:t>
+      </w:r>
+      <w:r>
+        <w:rPr>
+          <w:b/>
+          <w:i/>
+          <w:color w:val="444444"/>
+          <w:sz w:val="20"/>
+        </w:rPr>
+        <w:t xml:space="preserve"> interim figure</w:t>
+      </w:r>
+      <w:r>
+        <w:rPr>
+          <w:i/>
+          <w:color w:val="444444"/>
+          <w:sz w:val="20"/>
+        </w:rPr>
+        <w:t>, and both of those appear in rows below that have not yet been rewritten.</w:t>
+      </w:r>
+    </w:p>
+    <w:p>
+      <w:pPr>
+        <w:spacing w:before="120" w:after="120"/>
+        <w:ind w:left="480"/>
+      </w:pPr>
+      <w:r>
+        <w:rPr>
+          <w:b/>
+          <w:i/>
+          <w:color w:val="444444"/>
+          <w:sz w:val="20"/>
+        </w:rPr>
+        <w:t>Four retracted figures. Do not quote any of them:</w:t>
+      </w:r>
+      <w:r>
+        <w:rPr>
+          <w:i/>
+          <w:color w:val="444444"/>
+          <w:sz w:val="20"/>
+        </w:rPr>
+        <w:t xml:space="preserve"> "under $2 million one-time", "under $100,000 a year", </w:t>
+      </w:r>
+      <w:r>
+        <w:rPr>
+          <w:b/>
+          <w:i/>
+          <w:color w:val="444444"/>
+          <w:sz w:val="20"/>
+        </w:rPr>
+        <w:t>"$13M–$182M"</w:t>
+      </w:r>
+      <w:r>
+        <w:rPr>
+          <w:i/>
+          <w:color w:val="444444"/>
+          <w:sz w:val="20"/>
+        </w:rPr>
+        <w:t xml:space="preserve">, </w:t>
+      </w:r>
+      <w:r>
+        <w:rPr>
+          <w:b/>
+          <w:i/>
+          <w:color w:val="444444"/>
+          <w:sz w:val="20"/>
+        </w:rPr>
+        <w:t>"$26M–$182M"</w:t>
+      </w:r>
+      <w:r>
+        <w:rPr>
+          <w:i/>
+          <w:color w:val="444444"/>
+          <w:sz w:val="20"/>
+        </w:rPr>
+        <w:t xml:space="preserve">. Also retracted as a </w:t>
+      </w:r>
+      <w:r>
+        <w:rPr>
+          <w:i/>
+          <w:color w:val="444444"/>
+          <w:sz w:val="20"/>
+        </w:rPr>
+        <w:t>claim</w:t>
+      </w:r>
+      <w:r>
+        <w:rPr>
+          <w:i/>
+          <w:color w:val="444444"/>
+          <w:sz w:val="20"/>
+        </w:rPr>
+        <w:t xml:space="preserve">: </w:t>
+      </w:r>
+      <w:r>
+        <w:rPr>
+          <w:b/>
+          <w:i/>
+          <w:color w:val="444444"/>
+          <w:sz w:val="20"/>
+        </w:rPr>
+        <w:t>"General fund cost: $0"</w:t>
+      </w:r>
+      <w:r>
+        <w:rPr>
+          <w:i/>
+          <w:color w:val="444444"/>
+          <w:sz w:val="20"/>
+        </w:rPr>
+        <w:t xml:space="preserve"> — the defensible form is "this bill requests no appropriation" (red team F-2, now fixed in 00 v1.3).</w:t>
+      </w:r>
+    </w:p>
+    <w:p>
+      <w:pPr>
+        <w:spacing w:before="120" w:after="120"/>
+        <w:ind w:left="480"/>
+      </w:pPr>
+      <w:r>
+        <w:rPr>
+          <w:b/>
+          <w:i/>
+          <w:color w:val="444444"/>
+          <w:sz w:val="20"/>
+        </w:rPr>
+        <w:t>Files 01, 03 and 04 are being reconciled to the $28M–$166M band separately</w:t>
+      </w:r>
+      <w:r>
+        <w:rPr>
+          <w:i/>
+          <w:color w:val="444444"/>
+          <w:sz w:val="20"/>
+        </w:rPr>
+        <w:t xml:space="preserve"> and still carry superseded figures until that lands. Of the fatal findings, </w:t>
+      </w:r>
+      <w:r>
+        <w:rPr>
+          <w:b/>
+          <w:i/>
+          <w:color w:val="444444"/>
+          <w:sz w:val="20"/>
+        </w:rPr>
+        <w:t>F-2 is fixed</w:t>
+      </w:r>
+      <w:r>
+        <w:rPr>
+          <w:i/>
+          <w:color w:val="444444"/>
+          <w:sz w:val="20"/>
+        </w:rPr>
+        <w:t xml:space="preserve"> in 00 v1.3; </w:t>
+      </w:r>
+      <w:r>
+        <w:rPr>
+          <w:b/>
+          <w:i/>
+          <w:color w:val="444444"/>
+          <w:sz w:val="20"/>
+        </w:rPr>
+        <w:t>F-1 is resolved in substance</w:t>
+      </w:r>
+      <w:r>
+        <w:rPr>
+          <w:i/>
+          <w:color w:val="444444"/>
+          <w:sz w:val="20"/>
+        </w:rPr>
+        <w:t xml:space="preserve"> — the guardrail is a mitigation worth roughly 59%–66% of the above-ANC excess, not a neutrality device — but the drafting choice it forces is open at Annex A Q3a and Q12.</w:t>
+      </w:r>
+    </w:p>
+    <w:p>
+      <w:pPr>
+        <w:spacing w:before="120" w:after="120"/>
+        <w:ind w:left="480"/>
+      </w:pPr>
+      <w:r>
+        <w:rPr>
+          <w:i/>
+          <w:color w:val="444444"/>
+          <w:sz w:val="20"/>
+        </w:rPr>
+        <w:t>Everything in the table below pre-dates this banner where the two disagree.</w:t>
       </w:r>
     </w:p>
     <w:tbl>

</xml_diff>